<commit_message>
docs: apply reviewer requested reference heading and hanging indents
</commit_message>
<xml_diff>
--- a/rapor/final_2026/deliverables/CS395_FinalReport_Efe_Han_Keleş_29September2026.docx
+++ b/rapor/final_2026/deliverables/CS395_FinalReport_Efe_Han_Keleş_29September2026.docx
@@ -4386,6 +4386,7 @@
         <w:pageBreakBefore/>
         <w:widowControl/>
         <w:spacing w:line="480" w:lineRule="auto" w:before="0" w:after="0"/>
+        <w:jc w:val="center"/>
       </w:pPr>
       <w:r>
         <w:rPr>
@@ -4401,6 +4402,7 @@
         <w:keepLines/>
         <w:widowControl/>
         <w:spacing w:line="240" w:lineRule="auto" w:before="0" w:after="240"/>
+        <w:ind w:left="300" w:hanging="300" w:right="0"/>
       </w:pPr>
       <w:r>
         <w:rPr>
@@ -4416,6 +4418,7 @@
         <w:keepLines/>
         <w:widowControl/>
         <w:spacing w:line="240" w:lineRule="auto" w:before="0" w:after="240"/>
+        <w:ind w:left="300" w:hanging="300" w:right="0"/>
       </w:pPr>
       <w:r>
         <w:rPr>
@@ -4431,6 +4434,7 @@
         <w:keepLines/>
         <w:widowControl/>
         <w:spacing w:line="240" w:lineRule="auto" w:before="0" w:after="240"/>
+        <w:ind w:left="300" w:hanging="300" w:right="0"/>
       </w:pPr>
       <w:r>
         <w:rPr>
@@ -4446,6 +4450,7 @@
         <w:keepLines/>
         <w:widowControl/>
         <w:spacing w:line="240" w:lineRule="auto" w:before="0" w:after="240"/>
+        <w:ind w:left="300" w:hanging="300" w:right="0"/>
       </w:pPr>
       <w:r>
         <w:rPr>
@@ -4478,6 +4483,7 @@
         <w:keepLines/>
         <w:widowControl/>
         <w:spacing w:line="240" w:lineRule="auto" w:before="0" w:after="240"/>
+        <w:ind w:left="300" w:hanging="300" w:right="0"/>
       </w:pPr>
       <w:r>
         <w:rPr>
@@ -4493,6 +4499,7 @@
         <w:keepLines/>
         <w:widowControl/>
         <w:spacing w:line="240" w:lineRule="auto" w:before="0" w:after="240"/>
+        <w:ind w:left="300" w:hanging="300" w:right="0"/>
       </w:pPr>
       <w:r>
         <w:rPr>
@@ -4508,6 +4515,7 @@
         <w:keepLines/>
         <w:widowControl/>
         <w:spacing w:line="240" w:lineRule="auto" w:before="0" w:after="240"/>
+        <w:ind w:left="300" w:hanging="300" w:right="0"/>
       </w:pPr>
       <w:r>
         <w:rPr>
@@ -4540,6 +4548,7 @@
         <w:keepLines/>
         <w:widowControl/>
         <w:spacing w:line="240" w:lineRule="auto" w:before="0" w:after="240"/>
+        <w:ind w:left="300" w:hanging="300" w:right="0"/>
       </w:pPr>
       <w:r>
         <w:rPr>
@@ -4555,6 +4564,7 @@
         <w:keepLines/>
         <w:widowControl/>
         <w:spacing w:line="240" w:lineRule="auto" w:before="0" w:after="240"/>
+        <w:ind w:left="300" w:hanging="300" w:right="0"/>
       </w:pPr>
       <w:r>
         <w:rPr>
@@ -4570,6 +4580,7 @@
         <w:keepLines/>
         <w:widowControl/>
         <w:spacing w:line="240" w:lineRule="auto" w:before="0" w:after="240"/>
+        <w:ind w:left="300" w:hanging="300" w:right="0"/>
       </w:pPr>
       <w:r>
         <w:rPr>
@@ -4585,6 +4596,7 @@
         <w:keepLines/>
         <w:widowControl/>
         <w:spacing w:line="240" w:lineRule="auto" w:before="0" w:after="240"/>
+        <w:ind w:left="300" w:hanging="300" w:right="0"/>
       </w:pPr>
       <w:r>
         <w:rPr>
@@ -4617,6 +4629,7 @@
         <w:keepLines/>
         <w:widowControl/>
         <w:spacing w:line="240" w:lineRule="auto" w:before="0" w:after="240"/>
+        <w:ind w:left="300" w:hanging="300" w:right="0"/>
       </w:pPr>
       <w:r>
         <w:rPr>
@@ -4649,6 +4662,7 @@
         <w:keepLines/>
         <w:widowControl/>
         <w:spacing w:line="240" w:lineRule="auto" w:before="0" w:after="240"/>
+        <w:ind w:left="300" w:hanging="300" w:right="0"/>
       </w:pPr>
       <w:r>
         <w:rPr>
@@ -4664,6 +4678,7 @@
         <w:keepLines/>
         <w:widowControl/>
         <w:spacing w:line="240" w:lineRule="auto" w:before="0" w:after="240"/>
+        <w:ind w:left="300" w:hanging="300" w:right="0"/>
       </w:pPr>
       <w:r>
         <w:rPr>
@@ -4679,6 +4694,7 @@
         <w:keepLines/>
         <w:widowControl/>
         <w:spacing w:line="240" w:lineRule="auto" w:before="0" w:after="240"/>
+        <w:ind w:left="300" w:hanging="300" w:right="0"/>
       </w:pPr>
       <w:r>
         <w:rPr>

</xml_diff>

<commit_message>
Correct rendered report figure alignment and add geometry checks
</commit_message>
<xml_diff>
--- a/rapor/final_2026/deliverables/CS395_FinalReport_Efe_Han_Keleş_29September2026.docx
+++ b/rapor/final_2026/deliverables/CS395_FinalReport_Efe_Han_Keleş_29September2026.docx
@@ -1123,8 +1123,9 @@
           <w:sz w:val="24"/>
         </w:rPr>
         <w:drawing>
-          <wp:inline xmlns:a="http://schemas.openxmlformats.org/drawingml/2006/main" xmlns:pic="http://schemas.openxmlformats.org/drawingml/2006/picture">
+          <wp:inline xmlns:a="http://schemas.openxmlformats.org/drawingml/2006/main" xmlns:pic="http://schemas.openxmlformats.org/drawingml/2006/picture" distT="0" distB="0" distL="0" distR="0">
             <wp:extent cx="5733288" cy="2276666"/>
+            <wp:effectExtent l="0" t="0" r="0" b="0"/>
             <wp:docPr id="1" name="Picture 1"/>
             <wp:cNvGraphicFramePr>
               <a:graphicFrameLocks noChangeAspect="1"/>
@@ -2776,8 +2777,9 @@
           <w:sz w:val="24"/>
         </w:rPr>
         <w:drawing>
-          <wp:inline xmlns:a="http://schemas.openxmlformats.org/drawingml/2006/main" xmlns:pic="http://schemas.openxmlformats.org/drawingml/2006/picture">
+          <wp:inline xmlns:a="http://schemas.openxmlformats.org/drawingml/2006/main" xmlns:pic="http://schemas.openxmlformats.org/drawingml/2006/picture" distT="0" distB="0" distL="0" distR="0">
             <wp:extent cx="5733288" cy="1339215"/>
+            <wp:effectExtent l="0" t="0" r="0" b="0"/>
             <wp:docPr id="2" name="Picture 2"/>
             <wp:cNvGraphicFramePr>
               <a:graphicFrameLocks noChangeAspect="1"/>
@@ -2883,8 +2885,9 @@
           <w:sz w:val="24"/>
         </w:rPr>
         <w:drawing>
-          <wp:inline xmlns:a="http://schemas.openxmlformats.org/drawingml/2006/main" xmlns:pic="http://schemas.openxmlformats.org/drawingml/2006/picture">
+          <wp:inline xmlns:a="http://schemas.openxmlformats.org/drawingml/2006/main" xmlns:pic="http://schemas.openxmlformats.org/drawingml/2006/picture" distT="0" distB="0" distL="0" distR="0">
             <wp:extent cx="5733288" cy="2408912"/>
+            <wp:effectExtent l="0" t="0" r="0" b="0"/>
             <wp:docPr id="3" name="Picture 3"/>
             <wp:cNvGraphicFramePr>
               <a:graphicFrameLocks noChangeAspect="1"/>

</xml_diff>